<commit_message>
compleeted filewatcher with filehash
</commit_message>
<xml_diff>
--- a/Policy Pulse + AVE collab/Module 1/Module 1 Lesson 3 Compliance legal and ethical considerations.docx
+++ b/Policy Pulse + AVE collab/Module 1/Module 1 Lesson 3 Compliance legal and ethical considerations.docx
@@ -21,7 +21,17 @@
           <w:color w:val="383F4D"/>
           <w:shd w:val="clear" w:color="auto" w:fill="FFFFFF"/>
         </w:rPr>
-        <w:t>Module 1</w:t>
+        <w:t xml:space="preserve">Module </w:t>
+      </w:r>
+      <w:r>
+        <w:rPr>
+          <w:rFonts w:ascii="Inter" w:hAnsi="Inter"/>
+          <w:b/>
+          <w:bCs/>
+          <w:color w:val="383F4D"/>
+          <w:shd w:val="clear" w:color="auto" w:fill="FFFFFF"/>
+        </w:rPr>
+        <w:t>1</w:t>
       </w:r>
     </w:p>
     <w:p>

</xml_diff>